<commit_message>
Agrega enlace al repositorio en la portada y en Parte C del reporte
Co-Authored-By: Claude Sonnet 5 <noreply@anthropic.com>
</commit_message>
<xml_diff>
--- a/Reporte_Actividad_Unidad_III.docx
+++ b/Reporte_Actividad_Unidad_III.docx
@@ -117,6 +117,37 @@
         </w:rPr>
         <w:t xml:space="preserve">Fecha: 15 de agosto de 2026</w:t>
       </w:r>
+    </w:p>
+    <w:p>
+      <w:pPr>
+        <w:spacing w:before="100"/>
+        <w:jc w:val="center"/>
+      </w:pPr>
+      <w:r>
+        <w:rPr>
+          <w:sz w:val="22"/>
+          <w:szCs w:val="22"/>
+        </w:rPr>
+        <w:t xml:space="preserve">Repositorio de codigo:</w:t>
+      </w:r>
+    </w:p>
+    <w:p>
+      <w:pPr>
+        <w:spacing w:before="40"/>
+        <w:jc w:val="center"/>
+      </w:pPr>
+      <w:hyperlink w:history="1" r:id="rIdyjdtgh1wasi-oeczk3ush">
+        <w:r>
+          <w:rPr>
+            <w:rStyle w:val="Hyperlink"/>
+            <w:color w:val="1155CC"/>
+            <w:sz w:val="22"/>
+            <w:szCs w:val="22"/>
+            <w:u w:val="single"/>
+          </w:rPr>
+          <w:t xml:space="preserve">https://github.com/igneaxx/proyecto-gestion-incidencias</w:t>
+        </w:r>
+      </w:hyperlink>
     </w:p>
     <w:p>
       <w:r>
@@ -3078,8 +3109,26 @@
         <w:jc w:val="both"/>
       </w:pPr>
       <w:r>
-        <w:t xml:space="preserve">Se implemento una demostracion minima funcional con backend en Node.js/Express (8 endpoints, incluyendo autenticacion con JWT, validacion de datos, control de acceso por rol y consumo de la API externa ipwho.is) y un frontend en HTML/CSS/JS que consume dichos endpoints. A continuacion se muestran capturas de la ejecucion real del sistema. El codigo fuente completo, con estructura organizada por capas (routes, middleware, data) y su README con instrucciones de ejecucion, se entrega junto a este reporte en la carpeta del proyecto.</w:t>
-      </w:r>
+        <w:t xml:space="preserve">Se implemento una demostracion minima funcional con backend en Node.js/Express (8 endpoints, incluyendo autenticacion con JWT, validacion de datos, control de acceso por rol y consumo de la API externa ipwho.is) y un frontend en HTML/CSS/JS que consume dichos endpoints. A continuacion se muestran capturas de la ejecucion real del sistema. El codigo fuente completo, con estructura organizada por capas (routes, middleware, data) y su README con instrucciones de ejecucion, esta publicado en el siguiente repositorio:</w:t>
+      </w:r>
+    </w:p>
+    <w:p>
+      <w:pPr>
+        <w:spacing w:after="160" w:before="100"/>
+        <w:jc w:val="left"/>
+      </w:pPr>
+      <w:hyperlink w:history="1" r:id="rIdnmhjzv5z1wuvgnuqlquxo">
+        <w:r>
+          <w:rPr>
+            <w:rStyle w:val="Hyperlink"/>
+            <w:color w:val="1155CC"/>
+            <w:sz w:val="21"/>
+            <w:szCs w:val="21"/>
+            <w:u w:val="single"/>
+          </w:rPr>
+          <w:t xml:space="preserve">https://github.com/igneaxx/proyecto-gestion-incidencias</w:t>
+        </w:r>
+      </w:hyperlink>
     </w:p>
     <w:p>
       <w:pPr>

</xml_diff>